<commit_message>
Make Christmas Casual duties sales-focused, like the Sales Consultant PD
Section 2 now mirrors the permanent part-time Sales Consultant's
duty categories (Customer Service & Sales, Product Knowledge &
Presentation, Teamwork & Reliability) as a plain list, still with
no KPI/performance-indicator table per prior instruction.

Co-Authored-By: Claude Sonnet 5 <noreply@anthropic.com>
Claude-Session: https://claude.ai/code/session_01VK6UyewxtJrczN1ZCuNzV8
</commit_message>
<xml_diff>
--- a/content/careers/Position_Description_Christmas_Casual.docx
+++ b/content/careers/Position_Description_Christmas_Casual.docx
@@ -151,17 +151,17 @@
           <w:sz w:val="22"/>
           <w:szCs w:val="22"/>
         </w:rPr>
-        <w:t xml:space="preserve">The Christmas Casual is responsible for supporting the York Jewellers team with warm, attentive customer service during our busiest trading period of the year, helping every customer feel welcomed and well looked after.</w:t>
-      </w:r>
-    </w:p>
-    <w:p>
-      <w:r>
-        <w:rPr>
-          <w:rFonts w:ascii="Arial" w:cs="Arial" w:eastAsia="Arial" w:hAnsi="Arial"/>
-          <w:sz w:val="22"/>
-          <w:szCs w:val="22"/>
-        </w:rPr>
-        <w:t xml:space="preserve">The role suits someone who is energetic, approachable and eager to learn, contributing to a positive customer experience and a smoothly running store throughout the Christmas trading period.</w:t>
+        <w:t xml:space="preserve">The Christmas Casual is responsible for delivering warm, attentive customer service and supporting sales during York Jewellers’ busiest trading period of the year, helping every customer find the right piece for their occasion.</w:t>
+      </w:r>
+    </w:p>
+    <w:p>
+      <w:r>
+        <w:rPr>
+          <w:rFonts w:ascii="Arial" w:cs="Arial" w:eastAsia="Arial" w:hAnsi="Arial"/>
+          <w:sz w:val="22"/>
+          <w:szCs w:val="22"/>
+        </w:rPr>
+        <w:t xml:space="preserve">The role combines strong customer service and selling skills with product knowledge, professional presentation and teamwork, ensuring every customer feels valued and well looked after from the moment they enter the store.</w:t>
       </w:r>
     </w:p>
     <w:p>
@@ -184,138 +184,230 @@
     </w:p>
     <w:p>
       <w:pPr>
-        <w:pStyle w:val="ListParagraph"/>
-        <w:numPr>
-          <w:ilvl w:val="0"/>
-          <w:numId w:val="2"/>
-        </w:numPr>
-      </w:pPr>
-      <w:r>
-        <w:rPr>
-          <w:rFonts w:ascii="Arial" w:cs="Arial" w:eastAsia="Arial" w:hAnsi="Arial"/>
-          <w:sz w:val="22"/>
-          <w:szCs w:val="22"/>
-        </w:rPr>
-        <w:t xml:space="preserve">Welcome and engage every customer warmly during the Christmas trading period</w:t>
-      </w:r>
-    </w:p>
-    <w:p>
-      <w:pPr>
-        <w:pStyle w:val="ListParagraph"/>
-        <w:numPr>
-          <w:ilvl w:val="0"/>
-          <w:numId w:val="2"/>
-        </w:numPr>
-      </w:pPr>
-      <w:r>
-        <w:rPr>
-          <w:rFonts w:ascii="Arial" w:cs="Arial" w:eastAsia="Arial" w:hAnsi="Arial"/>
-          <w:sz w:val="22"/>
-          <w:szCs w:val="22"/>
-        </w:rPr>
-        <w:t xml:space="preserve">Support the team with customer service and sales on the shop floor</w:t>
-      </w:r>
-    </w:p>
-    <w:p>
-      <w:pPr>
-        <w:pStyle w:val="ListParagraph"/>
-        <w:numPr>
-          <w:ilvl w:val="0"/>
-          <w:numId w:val="2"/>
-        </w:numPr>
-      </w:pPr>
-      <w:r>
-        <w:rPr>
-          <w:rFonts w:ascii="Arial" w:cs="Arial" w:eastAsia="Arial" w:hAnsi="Arial"/>
-          <w:sz w:val="22"/>
-          <w:szCs w:val="22"/>
-        </w:rPr>
-        <w:t xml:space="preserve">Listen to customers’ needs and help direct them to the right product or team member</w:t>
-      </w:r>
-    </w:p>
-    <w:p>
-      <w:pPr>
-        <w:pStyle w:val="ListParagraph"/>
-        <w:numPr>
-          <w:ilvl w:val="0"/>
-          <w:numId w:val="2"/>
-        </w:numPr>
-      </w:pPr>
-      <w:r>
-        <w:rPr>
-          <w:rFonts w:ascii="Arial" w:cs="Arial" w:eastAsia="Arial" w:hAnsi="Arial"/>
-          <w:sz w:val="22"/>
-          <w:szCs w:val="22"/>
-        </w:rPr>
-        <w:t xml:space="preserve">Build product knowledge to confidently assist customers</w:t>
-      </w:r>
-    </w:p>
-    <w:p>
-      <w:pPr>
-        <w:pStyle w:val="ListParagraph"/>
-        <w:numPr>
-          <w:ilvl w:val="0"/>
-          <w:numId w:val="2"/>
-        </w:numPr>
-      </w:pPr>
-      <w:r>
-        <w:rPr>
-          <w:rFonts w:ascii="Arial" w:cs="Arial" w:eastAsia="Arial" w:hAnsi="Arial"/>
-          <w:sz w:val="22"/>
-          <w:szCs w:val="22"/>
-        </w:rPr>
-        <w:t xml:space="preserve">Provide friendly, efficient service at the point of sale</w:t>
-      </w:r>
-    </w:p>
-    <w:p>
-      <w:pPr>
-        <w:pStyle w:val="ListParagraph"/>
-        <w:numPr>
-          <w:ilvl w:val="0"/>
-          <w:numId w:val="2"/>
-        </w:numPr>
-      </w:pPr>
-      <w:r>
-        <w:rPr>
-          <w:rFonts w:ascii="Arial" w:cs="Arial" w:eastAsia="Arial" w:hAnsi="Arial"/>
-          <w:sz w:val="22"/>
-          <w:szCs w:val="22"/>
-        </w:rPr>
-        <w:t xml:space="preserve">Support store presentation and stock replenishment during busy periods</w:t>
-      </w:r>
-    </w:p>
-    <w:p>
-      <w:pPr>
-        <w:pStyle w:val="ListParagraph"/>
-        <w:numPr>
-          <w:ilvl w:val="0"/>
-          <w:numId w:val="2"/>
-        </w:numPr>
-      </w:pPr>
-      <w:r>
-        <w:rPr>
-          <w:rFonts w:ascii="Arial" w:cs="Arial" w:eastAsia="Arial" w:hAnsi="Arial"/>
-          <w:sz w:val="22"/>
-          <w:szCs w:val="22"/>
-        </w:rPr>
-        <w:t xml:space="preserve">Work flexibly and reliably across rostered shifts throughout the Christmas period</w:t>
-      </w:r>
-    </w:p>
-    <w:p>
-      <w:pPr>
-        <w:pStyle w:val="ListParagraph"/>
-        <w:numPr>
-          <w:ilvl w:val="0"/>
-          <w:numId w:val="2"/>
-        </w:numPr>
-      </w:pPr>
-      <w:r>
-        <w:rPr>
-          <w:rFonts w:ascii="Arial" w:cs="Arial" w:eastAsia="Arial" w:hAnsi="Arial"/>
-          <w:sz w:val="22"/>
-          <w:szCs w:val="22"/>
-        </w:rPr>
-        <w:t xml:space="preserve">Collaborate with the team to keep the store running smoothly during peak trade</w:t>
+        <w:pStyle w:val="Heading3"/>
+      </w:pPr>
+      <w:r>
+        <w:t xml:space="preserve">Customer Service &amp; Sales</w:t>
+      </w:r>
+    </w:p>
+    <w:p>
+      <w:pPr>
+        <w:pStyle w:val="ListParagraph"/>
+        <w:numPr>
+          <w:ilvl w:val="0"/>
+          <w:numId w:val="2"/>
+        </w:numPr>
+      </w:pPr>
+      <w:r>
+        <w:rPr>
+          <w:rFonts w:ascii="Arial" w:cs="Arial" w:eastAsia="Arial" w:hAnsi="Arial"/>
+          <w:sz w:val="22"/>
+          <w:szCs w:val="22"/>
+        </w:rPr>
+        <w:t xml:space="preserve">Greet and engage every customer warmly and professionally</w:t>
+      </w:r>
+    </w:p>
+    <w:p>
+      <w:pPr>
+        <w:pStyle w:val="ListParagraph"/>
+        <w:numPr>
+          <w:ilvl w:val="0"/>
+          <w:numId w:val="2"/>
+        </w:numPr>
+      </w:pPr>
+      <w:r>
+        <w:rPr>
+          <w:rFonts w:ascii="Arial" w:cs="Arial" w:eastAsia="Arial" w:hAnsi="Arial"/>
+          <w:sz w:val="22"/>
+          <w:szCs w:val="22"/>
+        </w:rPr>
+        <w:t xml:space="preserve">Identify customer needs through active listening and thoughtful questioning</w:t>
+      </w:r>
+    </w:p>
+    <w:p>
+      <w:pPr>
+        <w:pStyle w:val="ListParagraph"/>
+        <w:numPr>
+          <w:ilvl w:val="0"/>
+          <w:numId w:val="2"/>
+        </w:numPr>
+      </w:pPr>
+      <w:r>
+        <w:rPr>
+          <w:rFonts w:ascii="Arial" w:cs="Arial" w:eastAsia="Arial" w:hAnsi="Arial"/>
+          <w:sz w:val="22"/>
+          <w:szCs w:val="22"/>
+        </w:rPr>
+        <w:t xml:space="preserve">Recommend products and services that suit each customer’s needs and occasion</w:t>
+      </w:r>
+    </w:p>
+    <w:p>
+      <w:pPr>
+        <w:pStyle w:val="ListParagraph"/>
+        <w:numPr>
+          <w:ilvl w:val="0"/>
+          <w:numId w:val="2"/>
+        </w:numPr>
+      </w:pPr>
+      <w:r>
+        <w:rPr>
+          <w:rFonts w:ascii="Arial" w:cs="Arial" w:eastAsia="Arial" w:hAnsi="Arial"/>
+          <w:sz w:val="22"/>
+          <w:szCs w:val="22"/>
+        </w:rPr>
+        <w:t xml:space="preserve">Confidently explain product features, craftsmanship and value to customers</w:t>
+      </w:r>
+    </w:p>
+    <w:p>
+      <w:pPr>
+        <w:pStyle w:val="ListParagraph"/>
+        <w:numPr>
+          <w:ilvl w:val="0"/>
+          <w:numId w:val="2"/>
+        </w:numPr>
+      </w:pPr>
+      <w:r>
+        <w:rPr>
+          <w:rFonts w:ascii="Arial" w:cs="Arial" w:eastAsia="Arial" w:hAnsi="Arial"/>
+          <w:sz w:val="22"/>
+          <w:szCs w:val="22"/>
+        </w:rPr>
+        <w:t xml:space="preserve">Support the team in working towards store sales targets during the Christmas period</w:t>
+      </w:r>
+    </w:p>
+    <w:p>
+      <w:pPr>
+        <w:pStyle w:val="ListParagraph"/>
+        <w:numPr>
+          <w:ilvl w:val="0"/>
+          <w:numId w:val="2"/>
+        </w:numPr>
+      </w:pPr>
+      <w:r>
+        <w:rPr>
+          <w:rFonts w:ascii="Arial" w:cs="Arial" w:eastAsia="Arial" w:hAnsi="Arial"/>
+          <w:sz w:val="22"/>
+          <w:szCs w:val="22"/>
+        </w:rPr>
+        <w:t xml:space="preserve">Provide a seamless, friendly experience at the point of sale</w:t>
+      </w:r>
+    </w:p>
+    <w:p>
+      <w:pPr>
+        <w:pStyle w:val="Heading3"/>
+      </w:pPr>
+      <w:r>
+        <w:t xml:space="preserve">Product Knowledge &amp; Presentation</w:t>
+      </w:r>
+    </w:p>
+    <w:p>
+      <w:pPr>
+        <w:pStyle w:val="ListParagraph"/>
+        <w:numPr>
+          <w:ilvl w:val="0"/>
+          <w:numId w:val="2"/>
+        </w:numPr>
+      </w:pPr>
+      <w:r>
+        <w:rPr>
+          <w:rFonts w:ascii="Arial" w:cs="Arial" w:eastAsia="Arial" w:hAnsi="Arial"/>
+          <w:sz w:val="22"/>
+          <w:szCs w:val="22"/>
+        </w:rPr>
+        <w:t xml:space="preserve">Build knowledge of the current product range</w:t>
+      </w:r>
+    </w:p>
+    <w:p>
+      <w:pPr>
+        <w:pStyle w:val="ListParagraph"/>
+        <w:numPr>
+          <w:ilvl w:val="0"/>
+          <w:numId w:val="2"/>
+        </w:numPr>
+      </w:pPr>
+      <w:r>
+        <w:rPr>
+          <w:rFonts w:ascii="Arial" w:cs="Arial" w:eastAsia="Arial" w:hAnsi="Arial"/>
+          <w:sz w:val="22"/>
+          <w:szCs w:val="22"/>
+        </w:rPr>
+        <w:t xml:space="preserve">Ensure merchandise and displays are presented to a high standard</w:t>
+      </w:r>
+    </w:p>
+    <w:p>
+      <w:pPr>
+        <w:pStyle w:val="ListParagraph"/>
+        <w:numPr>
+          <w:ilvl w:val="0"/>
+          <w:numId w:val="2"/>
+        </w:numPr>
+      </w:pPr>
+      <w:r>
+        <w:rPr>
+          <w:rFonts w:ascii="Arial" w:cs="Arial" w:eastAsia="Arial" w:hAnsi="Arial"/>
+          <w:sz w:val="22"/>
+          <w:szCs w:val="22"/>
+        </w:rPr>
+        <w:t xml:space="preserve">Support store presentation and cleanliness standards</w:t>
+      </w:r>
+    </w:p>
+    <w:p>
+      <w:pPr>
+        <w:pStyle w:val="Heading3"/>
+      </w:pPr>
+      <w:r>
+        <w:t xml:space="preserve">Teamwork &amp; Reliability</w:t>
+      </w:r>
+    </w:p>
+    <w:p>
+      <w:pPr>
+        <w:pStyle w:val="ListParagraph"/>
+        <w:numPr>
+          <w:ilvl w:val="0"/>
+          <w:numId w:val="2"/>
+        </w:numPr>
+      </w:pPr>
+      <w:r>
+        <w:rPr>
+          <w:rFonts w:ascii="Arial" w:cs="Arial" w:eastAsia="Arial" w:hAnsi="Arial"/>
+          <w:sz w:val="22"/>
+          <w:szCs w:val="22"/>
+        </w:rPr>
+        <w:t xml:space="preserve">Work collaboratively with the team to deliver a consistent customer experience</w:t>
+      </w:r>
+    </w:p>
+    <w:p>
+      <w:pPr>
+        <w:pStyle w:val="ListParagraph"/>
+        <w:numPr>
+          <w:ilvl w:val="0"/>
+          <w:numId w:val="2"/>
+        </w:numPr>
+      </w:pPr>
+      <w:r>
+        <w:rPr>
+          <w:rFonts w:ascii="Arial" w:cs="Arial" w:eastAsia="Arial" w:hAnsi="Arial"/>
+          <w:sz w:val="22"/>
+          <w:szCs w:val="22"/>
+        </w:rPr>
+        <w:t xml:space="preserve">Maintain full availability throughout the Christmas trading period</w:t>
+      </w:r>
+    </w:p>
+    <w:p>
+      <w:pPr>
+        <w:pStyle w:val="ListParagraph"/>
+        <w:numPr>
+          <w:ilvl w:val="0"/>
+          <w:numId w:val="2"/>
+        </w:numPr>
+      </w:pPr>
+      <w:r>
+        <w:rPr>
+          <w:rFonts w:ascii="Arial" w:cs="Arial" w:eastAsia="Arial" w:hAnsi="Arial"/>
+          <w:sz w:val="22"/>
+          <w:szCs w:val="22"/>
+        </w:rPr>
+        <w:t xml:space="preserve">Attend all rostered shifts, arriving on time and ready to work</w:t>
       </w:r>
     </w:p>
     <w:p>
@@ -384,7 +476,7 @@
           <w:sz w:val="22"/>
           <w:szCs w:val="22"/>
         </w:rPr>
-        <w:t xml:space="preserve">Is accountable for making a positive, reliable contribution to the team during peak trade</w:t>
+        <w:t xml:space="preserve">Is accountable for supporting the store’s sales performance during the Christmas trading period</w:t>
       </w:r>
     </w:p>
     <w:p>

</xml_diff>